<commit_message>
lab 6 and lab 5 updated
</commit_message>
<xml_diff>
--- a/Labs/Lab_5/Lab5.docx
+++ b/Labs/Lab_5/Lab5.docx
@@ -10,34 +10,40 @@
         <w:t>Team: Sakka Mohamad-Mario, Mirghani Abdelrahman 1241EB</w:t>
       </w:r>
     </w:p>
-    <w:p/>
-    <w:p/>
-    <w:p>
-      <w:pPr>
-        <w:pStyle w:val="Title"/>
-      </w:pPr>
-      <w:r>
-        <w:t>Exercises 2 &amp; 3</w:t>
-      </w:r>
-    </w:p>
-    <w:p>
-      <w:pPr>
-        <w:pStyle w:val="Title"/>
-      </w:pPr>
-      <w:r>
-        <w:drawing>
-          <wp:inline distT="0" distB="0" distL="0" distR="0" wp14:anchorId="04178343" wp14:editId="1AF6E032">
-            <wp:extent cx="5943600" cy="1931670"/>
-            <wp:effectExtent l="0" t="0" r="0" b="0"/>
-            <wp:docPr id="211323005" name="Picture 1"/>
-            <wp:cNvGraphicFramePr>
-              <a:graphicFrameLocks xmlns:a="http://schemas.openxmlformats.org/drawingml/2006/main" noChangeAspect="1"/>
-            </wp:cNvGraphicFramePr>
-            <a:graphic xmlns:a="http://schemas.openxmlformats.org/drawingml/2006/main">
-              <a:graphicData uri="http://schemas.openxmlformats.org/drawingml/2006/picture">
-                <pic:pic xmlns:pic="http://schemas.openxmlformats.org/drawingml/2006/picture">
-                  <pic:nvPicPr>
-                    <pic:cNvPr id="211323005" name=""/>
+    <w:p>
+      <w:pPr>
+        <w:pStyle w:val="Title"/>
+      </w:pPr>
+    </w:p>
+    <w:p>
+      <w:pPr>
+        <w:pStyle w:val="Title"/>
+      </w:pPr>
+      <w:r>
+        <w:t xml:space="preserve">Exercise </w:t>
+      </w:r>
+      <w:r>
+        <w:t>2&amp;</w:t>
+      </w:r>
+      <w:r>
+        <w:t>3</w:t>
+      </w:r>
+    </w:p>
+    <w:p>
+      <w:r>
+        <w:drawing>
+          <wp:inline distT="0" distB="0" distL="0" distR="0" wp14:anchorId="6F0F7249" wp14:editId="679E2F36">
+            <wp:extent cx="5943600" cy="3689350"/>
+            <wp:effectExtent l="0" t="0" r="0" b="6350"/>
+            <wp:docPr id="1196036262" name="Picture 1"/>
+            <wp:cNvGraphicFramePr>
+              <a:graphicFrameLocks xmlns:a="http://schemas.openxmlformats.org/drawingml/2006/main" noChangeAspect="1"/>
+            </wp:cNvGraphicFramePr>
+            <a:graphic xmlns:a="http://schemas.openxmlformats.org/drawingml/2006/main">
+              <a:graphicData uri="http://schemas.openxmlformats.org/drawingml/2006/picture">
+                <pic:pic xmlns:pic="http://schemas.openxmlformats.org/drawingml/2006/picture">
+                  <pic:nvPicPr>
+                    <pic:cNvPr id="1196036262" name=""/>
                     <pic:cNvPicPr/>
                   </pic:nvPicPr>
                   <pic:blipFill>
@@ -49,7 +55,7 @@
                   <pic:spPr>
                     <a:xfrm>
                       <a:off x="0" y="0"/>
-                      <a:ext cx="5943600" cy="1931670"/>
+                      <a:ext cx="5943600" cy="3689350"/>
                     </a:xfrm>
                     <a:prstGeom prst="rect">
                       <a:avLst/>
@@ -75,6 +81,10 @@
         <w:pStyle w:val="Title"/>
       </w:pPr>
       <w:r>
+        <w:rPr>
+          <w:noProof/>
+        </w:rPr>
+        <w:lastRenderedPageBreak/>
         <w:drawing>
           <wp:inline distT="0" distB="0" distL="0" distR="0" wp14:anchorId="3B8A483F" wp14:editId="6E69BB43">
             <wp:extent cx="4148254" cy="3448634"/>
@@ -116,11 +126,6 @@
       <w:pPr>
         <w:pStyle w:val="Title"/>
       </w:pPr>
-    </w:p>
-    <w:p>
-      <w:pPr>
-        <w:pStyle w:val="Title"/>
-      </w:pPr>
       <w:r>
         <w:t>Exercise 5</w:t>
       </w:r>
@@ -130,6 +135,10 @@
         <w:pStyle w:val="Title"/>
       </w:pPr>
       <w:r>
+        <w:rPr>
+          <w:noProof/>
+        </w:rPr>
+        <w:lastRenderedPageBreak/>
         <w:drawing>
           <wp:inline distT="0" distB="0" distL="0" distR="0" wp14:anchorId="0BE36E1F" wp14:editId="7B024D3D">
             <wp:extent cx="5943600" cy="4904740"/>
@@ -185,6 +194,9 @@
         <w:pStyle w:val="Title"/>
       </w:pPr>
       <w:r>
+        <w:rPr>
+          <w:noProof/>
+        </w:rPr>
         <w:lastRenderedPageBreak/>
         <w:drawing>
           <wp:inline distT="0" distB="0" distL="0" distR="0" wp14:anchorId="20817436" wp14:editId="2154111D">
@@ -241,6 +253,9 @@
         <w:pStyle w:val="Title"/>
       </w:pPr>
       <w:r>
+        <w:rPr>
+          <w:noProof/>
+        </w:rPr>
         <w:lastRenderedPageBreak/>
         <w:drawing>
           <wp:inline distT="0" distB="0" distL="0" distR="0" wp14:anchorId="6982ABD1" wp14:editId="4B688387">
@@ -297,6 +312,9 @@
         <w:pStyle w:val="Title"/>
       </w:pPr>
       <w:r>
+        <w:rPr>
+          <w:noProof/>
+        </w:rPr>
         <w:lastRenderedPageBreak/>
         <w:drawing>
           <wp:inline distT="0" distB="0" distL="0" distR="0" wp14:anchorId="3278B4D8" wp14:editId="5BBE8CF2">
@@ -353,6 +371,9 @@
         <w:pStyle w:val="Title"/>
       </w:pPr>
       <w:r>
+        <w:rPr>
+          <w:noProof/>
+        </w:rPr>
         <w:drawing>
           <wp:inline distT="0" distB="0" distL="0" distR="0" wp14:anchorId="2150D137" wp14:editId="6CE861AB">
             <wp:extent cx="5943600" cy="1741170"/>
@@ -408,6 +429,9 @@
         <w:pStyle w:val="Title"/>
       </w:pPr>
       <w:r>
+        <w:rPr>
+          <w:noProof/>
+        </w:rPr>
         <w:lastRenderedPageBreak/>
         <w:drawing>
           <wp:inline distT="0" distB="0" distL="0" distR="0" wp14:anchorId="5FB4BFD8" wp14:editId="001C35F1">
@@ -456,17 +480,17 @@
         <w:pStyle w:val="Title"/>
       </w:pPr>
       <w:r>
-        <w:t>Exercise 1</w:t>
-      </w:r>
-      <w:r>
-        <w:t>1</w:t>
-      </w:r>
-    </w:p>
-    <w:p>
-      <w:pPr>
-        <w:pStyle w:val="Title"/>
-      </w:pPr>
-      <w:r>
+        <w:t>Exercise 11</w:t>
+      </w:r>
+    </w:p>
+    <w:p>
+      <w:pPr>
+        <w:pStyle w:val="Title"/>
+      </w:pPr>
+      <w:r>
+        <w:rPr>
+          <w:noProof/>
+        </w:rPr>
         <w:lastRenderedPageBreak/>
         <w:drawing>
           <wp:inline distT="0" distB="0" distL="0" distR="0" wp14:anchorId="1E8ADC4D" wp14:editId="0E5CB51B">
@@ -510,6 +534,9 @@
         <w:pStyle w:val="Title"/>
       </w:pPr>
       <w:r>
+        <w:rPr>
+          <w:noProof/>
+        </w:rPr>
         <w:drawing>
           <wp:inline distT="0" distB="0" distL="0" distR="0" wp14:anchorId="2AC9BD4C" wp14:editId="2E5DC70C">
             <wp:extent cx="5943600" cy="3505200"/>
@@ -552,17 +579,17 @@
         <w:pStyle w:val="Title"/>
       </w:pPr>
       <w:r>
-        <w:t>Exercise 1</w:t>
-      </w:r>
-      <w:r>
-        <w:t>2</w:t>
-      </w:r>
-    </w:p>
-    <w:p>
-      <w:pPr>
-        <w:pStyle w:val="Title"/>
-      </w:pPr>
-      <w:r>
+        <w:t>Exercise 12</w:t>
+      </w:r>
+    </w:p>
+    <w:p>
+      <w:pPr>
+        <w:pStyle w:val="Title"/>
+      </w:pPr>
+      <w:r>
+        <w:rPr>
+          <w:noProof/>
+        </w:rPr>
         <w:lastRenderedPageBreak/>
         <w:drawing>
           <wp:inline distT="0" distB="0" distL="0" distR="0" wp14:anchorId="17B5D94B" wp14:editId="365DE053">
@@ -606,17 +633,17 @@
         <w:pStyle w:val="Title"/>
       </w:pPr>
       <w:r>
-        <w:t>Exercise 1</w:t>
-      </w:r>
-      <w:r>
-        <w:t>3</w:t>
-      </w:r>
-    </w:p>
-    <w:p>
-      <w:pPr>
-        <w:pStyle w:val="Title"/>
-      </w:pPr>
-      <w:r>
+        <w:t>Exercise 13</w:t>
+      </w:r>
+    </w:p>
+    <w:p>
+      <w:pPr>
+        <w:pStyle w:val="Title"/>
+      </w:pPr>
+      <w:r>
+        <w:rPr>
+          <w:noProof/>
+        </w:rPr>
         <w:lastRenderedPageBreak/>
         <w:drawing>
           <wp:inline distT="0" distB="0" distL="0" distR="0" wp14:anchorId="47231EE9" wp14:editId="28E497C4">
@@ -660,17 +687,17 @@
         <w:pStyle w:val="Title"/>
       </w:pPr>
       <w:r>
-        <w:t>Exercise 1</w:t>
-      </w:r>
-      <w:r>
-        <w:t>4</w:t>
-      </w:r>
-    </w:p>
-    <w:p>
-      <w:pPr>
-        <w:pStyle w:val="Title"/>
-      </w:pPr>
-      <w:r>
+        <w:t>Exercise 14</w:t>
+      </w:r>
+    </w:p>
+    <w:p>
+      <w:pPr>
+        <w:pStyle w:val="Title"/>
+      </w:pPr>
+      <w:r>
+        <w:rPr>
+          <w:noProof/>
+        </w:rPr>
         <w:lastRenderedPageBreak/>
         <w:drawing>
           <wp:inline distT="0" distB="0" distL="0" distR="0" wp14:anchorId="3961B708" wp14:editId="63662BFB">
@@ -714,17 +741,17 @@
         <w:pStyle w:val="Title"/>
       </w:pPr>
       <w:r>
-        <w:t>Exercise 1</w:t>
-      </w:r>
-      <w:r>
-        <w:t>5</w:t>
-      </w:r>
-    </w:p>
-    <w:p>
-      <w:pPr>
-        <w:pStyle w:val="Title"/>
-      </w:pPr>
-      <w:r>
+        <w:t>Exercise 15</w:t>
+      </w:r>
+    </w:p>
+    <w:p>
+      <w:pPr>
+        <w:pStyle w:val="Title"/>
+      </w:pPr>
+      <w:r>
+        <w:rPr>
+          <w:noProof/>
+        </w:rPr>
         <w:lastRenderedPageBreak/>
         <w:drawing>
           <wp:inline distT="0" distB="0" distL="0" distR="0" wp14:anchorId="682A8E75" wp14:editId="0AFC029D">
@@ -768,6 +795,9 @@
         <w:pStyle w:val="Title"/>
       </w:pPr>
       <w:r>
+        <w:rPr>
+          <w:noProof/>
+        </w:rPr>
         <w:lastRenderedPageBreak/>
         <w:drawing>
           <wp:inline distT="0" distB="0" distL="0" distR="0" wp14:anchorId="7B2C2FD2" wp14:editId="5EAFA98B">
@@ -811,17 +841,17 @@
         <w:pStyle w:val="Title"/>
       </w:pPr>
       <w:r>
-        <w:t>Exercise 1</w:t>
-      </w:r>
-      <w:r>
-        <w:t>6</w:t>
-      </w:r>
-    </w:p>
-    <w:p>
-      <w:pPr>
-        <w:pStyle w:val="Title"/>
-      </w:pPr>
-      <w:r>
+        <w:t>Exercise 16</w:t>
+      </w:r>
+    </w:p>
+    <w:p>
+      <w:pPr>
+        <w:pStyle w:val="Title"/>
+      </w:pPr>
+      <w:r>
+        <w:rPr>
+          <w:noProof/>
+        </w:rPr>
         <w:lastRenderedPageBreak/>
         <w:drawing>
           <wp:inline distT="0" distB="0" distL="0" distR="0" wp14:anchorId="59E377EE" wp14:editId="2D72F6B5">
@@ -873,6 +903,9 @@
         <w:pStyle w:val="Title"/>
       </w:pPr>
       <w:r>
+        <w:rPr>
+          <w:noProof/>
+        </w:rPr>
         <w:lastRenderedPageBreak/>
         <w:drawing>
           <wp:inline distT="0" distB="0" distL="0" distR="0" wp14:anchorId="438C8E6C" wp14:editId="543C53F1">
@@ -924,6 +957,9 @@
         <w:pStyle w:val="Title"/>
       </w:pPr>
       <w:r>
+        <w:rPr>
+          <w:noProof/>
+        </w:rPr>
         <w:lastRenderedPageBreak/>
         <w:drawing>
           <wp:inline distT="0" distB="0" distL="0" distR="0" wp14:anchorId="1AB675D6" wp14:editId="19C5F2D2">
@@ -975,6 +1011,9 @@
         <w:pStyle w:val="Title"/>
       </w:pPr>
       <w:r>
+        <w:rPr>
+          <w:noProof/>
+        </w:rPr>
         <w:lastRenderedPageBreak/>
         <w:drawing>
           <wp:inline distT="0" distB="0" distL="0" distR="0" wp14:anchorId="5265A8BC" wp14:editId="2CCB231E">
@@ -1026,6 +1065,9 @@
         <w:pStyle w:val="Title"/>
       </w:pPr>
       <w:r>
+        <w:rPr>
+          <w:noProof/>
+        </w:rPr>
         <w:lastRenderedPageBreak/>
         <w:drawing>
           <wp:inline distT="0" distB="0" distL="0" distR="0" wp14:anchorId="4215108D" wp14:editId="78B8DC41">
@@ -1080,6 +1122,9 @@
         <w:pStyle w:val="Title"/>
       </w:pPr>
       <w:r>
+        <w:rPr>
+          <w:noProof/>
+        </w:rPr>
         <w:drawing>
           <wp:inline distT="0" distB="0" distL="0" distR="0" wp14:anchorId="18F4D865" wp14:editId="310E5E15">
             <wp:extent cx="5943600" cy="4136390"/>
@@ -1134,6 +1179,9 @@
         <w:pStyle w:val="Title"/>
       </w:pPr>
       <w:r>
+        <w:rPr>
+          <w:noProof/>
+        </w:rPr>
         <w:drawing>
           <wp:inline distT="0" distB="0" distL="0" distR="0" wp14:anchorId="6F3519F2" wp14:editId="0F626CC1">
             <wp:extent cx="5943600" cy="4175760"/>
@@ -1206,6 +1254,7 @@
       </w:pPr>
       <w:r>
         <w:rPr>
+          <w:noProof/>
           <w:lang w:val="pt-BR"/>
         </w:rPr>
         <w:lastRenderedPageBreak/>
@@ -1255,6 +1304,7 @@
       </w:pPr>
       <w:r>
         <w:rPr>
+          <w:noProof/>
           <w:lang w:val="pt-BR"/>
         </w:rPr>
         <w:lastRenderedPageBreak/>
@@ -1304,6 +1354,7 @@
       </w:pPr>
       <w:r>
         <w:rPr>
+          <w:noProof/>
           <w:lang w:val="pt-BR"/>
         </w:rPr>
         <w:lastRenderedPageBreak/>
@@ -1359,6 +1410,7 @@
       </w:pPr>
       <w:r>
         <w:rPr>
+          <w:noProof/>
           <w:lang w:val="pt-BR"/>
         </w:rPr>
         <w:drawing>
@@ -1436,6 +1488,7 @@
       </w:pPr>
       <w:r>
         <w:rPr>
+          <w:noProof/>
           <w:lang w:val="pt-BR"/>
         </w:rPr>
         <w:drawing>
@@ -1512,6 +1565,7 @@
       </w:pPr>
       <w:r>
         <w:rPr>
+          <w:noProof/>
           <w:lang w:val="pt-BR"/>
         </w:rPr>
         <w:lastRenderedPageBreak/>
@@ -1581,6 +1635,7 @@
       </w:pPr>
       <w:r>
         <w:rPr>
+          <w:noProof/>
           <w:lang w:val="pt-BR"/>
         </w:rPr>
         <w:lastRenderedPageBreak/>
@@ -1650,6 +1705,7 @@
       </w:pPr>
       <w:r>
         <w:rPr>
+          <w:noProof/>
           <w:lang w:val="pt-BR"/>
         </w:rPr>
         <w:lastRenderedPageBreak/>
@@ -1699,6 +1755,7 @@
       </w:pPr>
       <w:r>
         <w:rPr>
+          <w:noProof/>
           <w:lang w:val="pt-BR"/>
         </w:rPr>
         <w:drawing>
@@ -1767,6 +1824,7 @@
       </w:pPr>
       <w:r>
         <w:rPr>
+          <w:noProof/>
           <w:lang w:val="pt-BR"/>
         </w:rPr>
         <w:lastRenderedPageBreak/>
@@ -1842,6 +1900,7 @@
       </w:pPr>
       <w:r>
         <w:rPr>
+          <w:noProof/>
           <w:lang w:val="pt-BR"/>
         </w:rPr>
         <w:drawing>
@@ -1910,6 +1969,7 @@
       </w:pPr>
       <w:r>
         <w:rPr>
+          <w:noProof/>
           <w:lang w:val="pt-BR"/>
         </w:rPr>
         <w:lastRenderedPageBreak/>
@@ -1979,6 +2039,7 @@
       </w:pPr>
       <w:r>
         <w:rPr>
+          <w:noProof/>
           <w:lang w:val="pt-BR"/>
         </w:rPr>
         <w:drawing>
@@ -2048,6 +2109,7 @@
       </w:pPr>
       <w:r>
         <w:rPr>
+          <w:noProof/>
           <w:lang w:val="pt-BR"/>
         </w:rPr>
         <w:drawing>
@@ -2116,6 +2178,7 @@
       </w:pPr>
       <w:r>
         <w:rPr>
+          <w:noProof/>
           <w:lang w:val="pt-BR"/>
         </w:rPr>
         <w:lastRenderedPageBreak/>
@@ -2185,6 +2248,7 @@
       </w:pPr>
       <w:r>
         <w:rPr>
+          <w:noProof/>
           <w:lang w:val="pt-BR"/>
         </w:rPr>
         <w:lastRenderedPageBreak/>
@@ -2254,6 +2318,7 @@
       </w:pPr>
       <w:r>
         <w:rPr>
+          <w:noProof/>
           <w:lang w:val="pt-BR"/>
         </w:rPr>
         <w:lastRenderedPageBreak/>
@@ -2323,6 +2388,7 @@
       </w:pPr>
       <w:r>
         <w:rPr>
+          <w:noProof/>
           <w:lang w:val="pt-BR"/>
         </w:rPr>
         <w:lastRenderedPageBreak/>
@@ -2398,6 +2464,7 @@
       </w:pPr>
       <w:r>
         <w:rPr>
+          <w:noProof/>
           <w:lang w:val="pt-BR"/>
         </w:rPr>
         <w:lastRenderedPageBreak/>
@@ -2467,6 +2534,7 @@
       </w:pPr>
       <w:r>
         <w:rPr>
+          <w:noProof/>
           <w:lang w:val="pt-BR"/>
         </w:rPr>
         <w:lastRenderedPageBreak/>
@@ -2536,6 +2604,7 @@
       </w:pPr>
       <w:r>
         <w:rPr>
+          <w:noProof/>
           <w:lang w:val="pt-BR"/>
         </w:rPr>
         <w:lastRenderedPageBreak/>
@@ -2585,6 +2654,7 @@
       </w:pPr>
       <w:r>
         <w:rPr>
+          <w:noProof/>
           <w:lang w:val="pt-BR"/>
         </w:rPr>
         <w:drawing>
@@ -2653,6 +2723,7 @@
       </w:pPr>
       <w:r>
         <w:rPr>
+          <w:noProof/>
           <w:lang w:val="pt-BR"/>
         </w:rPr>
         <w:lastRenderedPageBreak/>
@@ -2724,6 +2795,7 @@
       </w:pPr>
       <w:r>
         <w:rPr>
+          <w:noProof/>
           <w:lang w:val="pt-BR"/>
         </w:rPr>
         <w:lastRenderedPageBreak/>
@@ -2780,6 +2852,7 @@
       </w:pPr>
       <w:r>
         <w:rPr>
+          <w:noProof/>
           <w:lang w:val="pt-BR"/>
         </w:rPr>
         <w:lastRenderedPageBreak/>
@@ -2836,6 +2909,7 @@
       </w:pPr>
       <w:r>
         <w:rPr>
+          <w:noProof/>
           <w:lang w:val="pt-BR"/>
         </w:rPr>
         <w:lastRenderedPageBreak/>
@@ -2892,6 +2966,7 @@
       </w:pPr>
       <w:r>
         <w:rPr>
+          <w:noProof/>
           <w:lang w:val="pt-BR"/>
         </w:rPr>
         <w:lastRenderedPageBreak/>
@@ -2948,6 +3023,7 @@
       </w:pPr>
       <w:r>
         <w:rPr>
+          <w:noProof/>
           <w:lang w:val="pt-BR"/>
         </w:rPr>
         <w:lastRenderedPageBreak/>
@@ -3004,6 +3080,7 @@
       </w:pPr>
       <w:r>
         <w:rPr>
+          <w:noProof/>
           <w:lang w:val="pt-BR"/>
         </w:rPr>
         <w:drawing>
@@ -3059,6 +3136,7 @@
       </w:pPr>
       <w:r>
         <w:rPr>
+          <w:noProof/>
           <w:lang w:val="pt-BR"/>
         </w:rPr>
         <w:lastRenderedPageBreak/>
@@ -3115,6 +3193,7 @@
       </w:pPr>
       <w:r>
         <w:rPr>
+          <w:noProof/>
           <w:lang w:val="pt-BR"/>
         </w:rPr>
         <w:drawing>
@@ -3170,6 +3249,7 @@
       </w:pPr>
       <w:r>
         <w:rPr>
+          <w:noProof/>
           <w:lang w:val="pt-BR"/>
         </w:rPr>
         <w:lastRenderedPageBreak/>
@@ -3219,6 +3299,7 @@
       </w:pPr>
       <w:r>
         <w:rPr>
+          <w:noProof/>
           <w:lang w:val="pt-BR"/>
         </w:rPr>
         <w:drawing>
@@ -3274,6 +3355,7 @@
       </w:pPr>
       <w:r>
         <w:rPr>
+          <w:noProof/>
           <w:lang w:val="pt-BR"/>
         </w:rPr>
         <w:lastRenderedPageBreak/>
@@ -3323,6 +3405,7 @@
       </w:pPr>
       <w:r>
         <w:rPr>
+          <w:noProof/>
           <w:lang w:val="pt-BR"/>
         </w:rPr>
         <w:drawing>
@@ -3378,6 +3461,7 @@
       </w:pPr>
       <w:r>
         <w:rPr>
+          <w:noProof/>
           <w:lang w:val="pt-BR"/>
         </w:rPr>
         <w:lastRenderedPageBreak/>
@@ -3442,6 +3526,7 @@
       </w:pPr>
       <w:r>
         <w:rPr>
+          <w:noProof/>
           <w:lang w:val="pt-BR"/>
         </w:rPr>
         <w:lastRenderedPageBreak/>
@@ -3498,6 +3583,7 @@
       </w:pPr>
       <w:r>
         <w:rPr>
+          <w:noProof/>
           <w:lang w:val="pt-BR"/>
         </w:rPr>
         <w:lastRenderedPageBreak/>
@@ -3554,6 +3640,7 @@
       </w:pPr>
       <w:r>
         <w:rPr>
+          <w:noProof/>
           <w:lang w:val="pt-BR"/>
         </w:rPr>
         <w:drawing>
@@ -3609,6 +3696,7 @@
       </w:pPr>
       <w:r>
         <w:rPr>
+          <w:noProof/>
           <w:lang w:val="pt-BR"/>
         </w:rPr>
         <w:lastRenderedPageBreak/>
@@ -3665,6 +3753,7 @@
       </w:pPr>
       <w:r>
         <w:rPr>
+          <w:noProof/>
           <w:lang w:val="pt-BR"/>
         </w:rPr>
         <w:lastRenderedPageBreak/>
@@ -3721,6 +3810,7 @@
       </w:pPr>
       <w:r>
         <w:rPr>
+          <w:noProof/>
           <w:lang w:val="pt-BR"/>
         </w:rPr>
         <w:lastRenderedPageBreak/>
@@ -3777,6 +3867,7 @@
       </w:pPr>
       <w:r>
         <w:rPr>
+          <w:noProof/>
           <w:lang w:val="pt-BR"/>
         </w:rPr>
         <w:drawing>
@@ -3831,6 +3922,7 @@
       </w:pPr>
       <w:r>
         <w:rPr>
+          <w:noProof/>
           <w:lang w:val="pt-BR"/>
         </w:rPr>
         <w:lastRenderedPageBreak/>
@@ -3887,6 +3979,7 @@
       </w:pPr>
       <w:r>
         <w:rPr>
+          <w:noProof/>
           <w:lang w:val="pt-BR"/>
         </w:rPr>
         <w:lastRenderedPageBreak/>
@@ -3943,6 +4036,7 @@
       </w:pPr>
       <w:r>
         <w:rPr>
+          <w:noProof/>
           <w:lang w:val="pt-BR"/>
         </w:rPr>
         <w:drawing>
@@ -4602,6 +4696,7 @@
   <w:style w:type="character" w:default="1" w:styleId="DefaultParagraphFont">
     <w:name w:val="Default Paragraph Font"/>
     <w:uiPriority w:val="1"/>
+    <w:semiHidden/>
     <w:unhideWhenUsed/>
   </w:style>
   <w:style w:type="table" w:default="1" w:styleId="TableNormal">

</xml_diff>